<commit_message>
docs: replace AI Evolution copyedited artifacts
</commit_message>
<xml_diff>
--- a/Working-Papers/AI-Evolution-as-an-Advancing-Approximation-Frontier/AI-Evolution-as-an-Advancing-Approximation-Frontier-v1.0.docx
+++ b/Working-Papers/AI-Evolution-as-an-Advancing-Approximation-Frontier/AI-Evolution-as-an-Advancing-Approximation-Frontier-v1.0.docx
@@ -125,7 +125,7 @@
         <w:pStyle w:val="FirstParagraph"/>
       </w:pPr>
       <w:r>
-        <w:t>AI development has repeatedly changed what counts as the next difficult problem. Scaling-law work suggested that larger models, more data, and more compute could produce predictable gains. Compute-optimal training then showed that how a fixed compute budget was allocated could matter more than simply increasing parameter count. More recently, inference-time scaling has shown that when computation is used can matter as much as how much pretrained capacity a system has [1], [2], [3].</w:t>
+        <w:t>AI development has repeatedly changed what counts as the next difficult problem. Scaling-law work suggested that larger models, more data, and more compute could produce predictable gains. Compute-optimal training then showed that how a fixed compute budget was allocated could matter more than simply increasing parameter count. More recently, inference-time scaling has shown that how computation is used can matter as much as how much pretrained capacity a system has [1], [2], [3].</w:t>
       </w:r>
     </w:p>
     <w:p>
@@ -253,7 +253,7 @@
         <w:pStyle w:val="FirstParagraph"/>
       </w:pPr>
       <w:r>
-        <w:t>Let HIₜ denote the manifestations of human intelligence relevant to the domain under consideration at time (t). Represent them abstractly as</w:t>
+        <w:t>Let HIₜ denote the manifestations of human intelligence relevant to the domain under consideration at time t. Represent them abstractly as</w:t>
       </w:r>
     </w:p>
     <w:p>
@@ -282,7 +282,7 @@
         <w:pStyle w:val="BodyText"/>
       </w:pPr>
       <w:r>
-        <w:t>Let AIₜ denote the corresponding artificial-system capability at time (t):</w:t>
+        <w:t>Let AIₜ denote the corresponding artificial-system capability at time t:</w:t>
       </w:r>
     </w:p>
     <w:p>
@@ -507,7 +507,7 @@
         <w:pStyle w:val="FirstParagraph"/>
       </w:pPr>
       <w:r>
-        <w:t>This is testable rather than definitional. Evidence against it would include broad capability improvements that reduce supposedly difficult target-side discrepancies at comparable or faster rates, or longitudinal comparisons showing no relationship between specifiability, evaluability, and time to reliable performance.</w:t>
+        <w:t>This is testable rather than definitional. Evidence against it would include broad capability improvements that reduce supposedly difficult target-side discrepancies as fast as or faster than clearer dimensions, or longitudinal comparisons showing no relationship between specifiability, evaluability, and time to reliable performance.</w:t>
       </w:r>
     </w:p>
     <w:p>
@@ -603,7 +603,7 @@
         <w:pStyle w:val="BodyText"/>
       </w:pPr>
       <w:r>
-        <w:t>A prospective test could treat development problems or evaluation dimensions as the unit of analysis, code target specifiability, evaluability, and feedback availability before observing later outcomes, define resolution using a common threshold, and compare time-to-resolution over a fixed observation window. Effort allocation, benchmark changes, and major shifts in available data or compute would need to be recorded alongside the outcome so that observed resolution rates are not interpreted as pure measure</w:t>
+        <w:t>A prospective test could use development problems or evaluation dimensions as units of analysis, code target specifiability, evaluability, and feedback availability before observing later outcomes, define resolution using a common threshold, and compare time-to-resolution over a fixed observation window. Effort allocation, benchmark changes, and major shifts in available data or compute would need to be recorded alongside the outcome so that observed resolution rates are not interpreted as pure measure</w:t>
       </w:r>
       <w:r>
         <w:t>s of intrinsic difficulty.</w:t>
@@ -996,7 +996,7 @@
         <w:pStyle w:val="BodyText"/>
       </w:pPr>
       <w:r>
-        <w:t>Anthropic reported in 2026, using one internal measurement framework, that Claude “led” 26% of measured AI research and engineering work and collaborated substantially on more than 90%, while not operating fully autonomously for any measured subset [15]. The figure illustrates substantial participation within that measured environment; cross-lab automation levels remain an open empirical question.</w:t>
+        <w:t>Anthropic reported in 2026, using one internal measurement framework, that Claude “led” 26% of measured AI research and engineering work and collaborated substantially on more than 90%, while not operating fully autonomously in any measured subset [15]. The figure illustrates substantial participation within that measured environment; cross-lab automation levels remain an open empirical question.</w:t>
       </w:r>
     </w:p>
     <w:p>
@@ -1256,14 +1256,14 @@
         <w:pStyle w:val="BodyText"/>
       </w:pPr>
       <w:r>
-        <w:t xml:space="preserve">Whether this concentration occurs is an empirical question. Some judgment-intensive tasks may also become highly automatable: </w:t>
+        <w:t xml:space="preserve">Whether this concentration occurs is an empirical question. Some judgment-intensive tasks may also become highly automatable. </w:t>
       </w:r>
       <w:r>
         <w:rPr>
           <w:b/>
           <w:bCs/>
         </w:rPr>
-        <w:t>does the human share of AI development become increasingly concentrated in weakly specified and judgment-intensive functions as more structured work is automated?</w:t>
+        <w:t>Does the human share of AI development become increasingly concentrated in weakly specified and judgment-intensive functions as more structured work is automated?</w:t>
       </w:r>
     </w:p>
     <w:p>
@@ -1483,7 +1483,7 @@
         <w:pStyle w:val="BodyText"/>
       </w:pPr>
       <w:r>
-        <w:t>“Regime” is therefore a judgment category rather than a sharply observable boundary. What counts as “reasonable” must be judged from the development options actually available at the time, so the boundary may remain contestable even retrospectively.</w:t>
+        <w:t>“Regime” is therefore a judgment category rather than a sharply observable boundary. What counts as “reasonable” must be judged against the development options actually available at the time, so the boundary may remain contestable even retrospectively.</w:t>
       </w:r>
     </w:p>
     <w:p>
@@ -2079,22 +2079,16 @@
         <w:ind w:left="259" w:hanging="259"/>
       </w:pPr>
       <w:r>
-        <w:t xml:space="preserve">[4] H. Cao, “Prediction–Attribution Conjugacy in Adaptive Decision Problems,” </w:t>
-      </w:r>
-      <w:r>
-        <w:t>W</w:t>
-      </w:r>
-      <w:r>
-        <w:t xml:space="preserve">orking paper, 2026. </w:t>
-      </w:r>
-      <w:r>
-        <w:t>Available</w:t>
-      </w:r>
-      <w:r>
-        <w:t xml:space="preserve"> at</w:t>
-      </w:r>
-      <w:r>
-        <w:t>: https://github.com/honggaoc-star/Research-Lab/blob/main/Working-Papers/Prediction-Attribution-Conjugacy-in-Adaptive-Decision-Problems/Prediction-Attribution-Conjugacy-in-Adaptive-Decision-Problems-v1.0.pdf</w:t>
+        <w:t xml:space="preserve">[4] H. Cao, </w:t>
+      </w:r>
+      <w:r>
+        <w:rPr>
+          <w:i/>
+        </w:rPr>
+        <w:t>Prediction–Attribution Conjugacy in Adaptive Decision Problems</w:t>
+      </w:r>
+      <w:r>
+        <w:t>, Working paper, 2026. Available at: https://github.com/honggaoc-star/Research-Lab/blob/main/Working-Papers/Prediction-Attribution-Conjugacy-in-Adaptive-Decision-Problems/Prediction-Attribution-Conjugacy-in-Adaptive-Decision-Problems-v1.0.pdf</w:t>
       </w:r>
     </w:p>
     <w:p>

</xml_diff>